<commit_message>
Arreglos que permiten el funcionamiento de las notificaciones.
Incluidas las configuraciones de transparencias
y nuevamente la Font de Elite
</commit_message>
<xml_diff>
--- a/DOC/History EDExplorer.docx
+++ b/DOC/History EDExplorer.docx
@@ -19,6 +19,17 @@
     </w:p>
     <w:p>
       <w:r>
+        <w:t xml:space="preserve">En función del numero de masas se puede estimar una </w:t>
+      </w:r>
+      <w:r>
+        <w:t>aterrizarle</w:t>
+      </w:r>
+      <w:r>
+        <w:t xml:space="preserve"> de alta gravedad.</w:t>
+      </w:r>
+    </w:p>
+    <w:p>
+      <w:r>
         <w:t xml:space="preserve">Modo </w:t>
       </w:r>
       <w:r>
@@ -107,17 +118,12 @@
         <w:t xml:space="preserve">La ventana tiene </w:t>
       </w:r>
       <w:proofErr w:type="spellStart"/>
-      <w:proofErr w:type="gramStart"/>
       <w:r>
         <w:t>Dispose</w:t>
       </w:r>
       <w:proofErr w:type="spellEnd"/>
       <w:r>
-        <w:t>(</w:t>
-      </w:r>
-      <w:proofErr w:type="gramEnd"/>
-      <w:r>
-        <w:t>)</w:t>
+        <w:t>()</w:t>
       </w:r>
       <w:r>
         <w:t>, mirar lo que hace allí, no creo que debería hacerlo.</w:t>
@@ -240,13 +246,8 @@
         <w:t xml:space="preserve"> no se entera.</w:t>
       </w:r>
       <w:r>
-        <w:t xml:space="preserve"> </w:t>
-      </w:r>
-      <w:proofErr w:type="gramStart"/>
-      <w:r>
-        <w:t>La debería volver a abrir?</w:t>
-      </w:r>
-      <w:proofErr w:type="gramEnd"/>
+        <w:t xml:space="preserve"> La debería volver a abrir?</w:t>
+      </w:r>
     </w:p>
     <w:p>
       <w:r>
@@ -1208,7 +1209,6 @@
         <w:t xml:space="preserve"> </w:t>
       </w:r>
       <w:proofErr w:type="spellStart"/>
-      <w:proofErr w:type="gramStart"/>
       <w:r>
         <w:rPr>
           <w:rFonts w:ascii="Consolas" w:hAnsi="Consolas" w:cs="Consolas"/>
@@ -1229,7 +1229,6 @@
         <w:t>(</w:t>
       </w:r>
       <w:proofErr w:type="spellStart"/>
-      <w:proofErr w:type="gramEnd"/>
       <w:r>
         <w:rPr>
           <w:rFonts w:ascii="Consolas" w:hAnsi="Consolas" w:cs="Consolas"/>
@@ -1492,7 +1491,6 @@
         <w:t xml:space="preserve"> </w:t>
       </w:r>
       <w:proofErr w:type="spellStart"/>
-      <w:proofErr w:type="gramStart"/>
       <w:r>
         <w:rPr>
           <w:rFonts w:ascii="Consolas" w:hAnsi="Consolas" w:cs="Consolas"/>
@@ -1513,7 +1511,6 @@
         <w:t>(</w:t>
       </w:r>
       <w:proofErr w:type="spellStart"/>
-      <w:proofErr w:type="gramEnd"/>
       <w:r>
         <w:rPr>
           <w:rFonts w:ascii="Consolas" w:hAnsi="Consolas" w:cs="Consolas"/>
@@ -1600,7 +1597,6 @@
         <w:t xml:space="preserve"> </w:t>
       </w:r>
       <w:proofErr w:type="spellStart"/>
-      <w:proofErr w:type="gramStart"/>
       <w:r>
         <w:rPr>
           <w:rFonts w:ascii="Consolas" w:hAnsi="Consolas" w:cs="Consolas"/>
@@ -1611,7 +1607,6 @@
         <w:t>s.Length</w:t>
       </w:r>
       <w:proofErr w:type="spellEnd"/>
-      <w:proofErr w:type="gramEnd"/>
       <w:r>
         <w:rPr>
           <w:rFonts w:ascii="Consolas" w:hAnsi="Consolas" w:cs="Consolas"/>
@@ -1645,7 +1640,6 @@
         <w:t xml:space="preserve">                   </w:t>
       </w:r>
       <w:proofErr w:type="spellStart"/>
-      <w:proofErr w:type="gramStart"/>
       <w:r>
         <w:rPr>
           <w:rFonts w:ascii="Consolas" w:hAnsi="Consolas" w:cs="Consolas"/>
@@ -1656,7 +1650,6 @@
         <w:t>s.Replace</w:t>
       </w:r>
       <w:proofErr w:type="spellEnd"/>
-      <w:proofErr w:type="gramEnd"/>
       <w:r>
         <w:rPr>
           <w:rFonts w:ascii="Consolas" w:hAnsi="Consolas" w:cs="Consolas"/>
@@ -2445,7 +2438,6 @@
         <w:t xml:space="preserve">            cadena = </w:t>
       </w:r>
       <w:proofErr w:type="spellStart"/>
-      <w:proofErr w:type="gramStart"/>
       <w:r>
         <w:rPr>
           <w:rFonts w:ascii="Consolas" w:hAnsi="Consolas" w:cs="Consolas"/>
@@ -2456,7 +2448,6 @@
         <w:t>cadena.ToLower</w:t>
       </w:r>
       <w:proofErr w:type="spellEnd"/>
-      <w:proofErr w:type="gramEnd"/>
       <w:r>
         <w:rPr>
           <w:rFonts w:ascii="Consolas" w:hAnsi="Consolas" w:cs="Consolas"/>
@@ -2684,7 +2675,6 @@
         <w:t xml:space="preserve">            trozo = </w:t>
       </w:r>
       <w:proofErr w:type="spellStart"/>
-      <w:proofErr w:type="gramStart"/>
       <w:r>
         <w:rPr>
           <w:rFonts w:ascii="Consolas" w:hAnsi="Consolas" w:cs="Consolas"/>
@@ -2695,7 +2685,6 @@
         <w:t>cadena.Substring</w:t>
       </w:r>
       <w:proofErr w:type="spellEnd"/>
-      <w:proofErr w:type="gramEnd"/>
       <w:r>
         <w:rPr>
           <w:rFonts w:ascii="Consolas" w:hAnsi="Consolas" w:cs="Consolas"/>
@@ -2972,7 +2961,6 @@
         <w:t xml:space="preserve"> i = 1; i &lt;= (</w:t>
       </w:r>
       <w:proofErr w:type="spellStart"/>
-      <w:proofErr w:type="gramStart"/>
       <w:r>
         <w:rPr>
           <w:rFonts w:ascii="Consolas" w:hAnsi="Consolas" w:cs="Consolas"/>
@@ -2983,7 +2971,6 @@
         <w:t>cadena.Length</w:t>
       </w:r>
       <w:proofErr w:type="spellEnd"/>
-      <w:proofErr w:type="gramEnd"/>
       <w:r>
         <w:rPr>
           <w:rFonts w:ascii="Consolas" w:hAnsi="Consolas" w:cs="Consolas"/>
@@ -3120,7 +3107,6 @@
         <w:t xml:space="preserve"> = </w:t>
       </w:r>
       <w:proofErr w:type="spellStart"/>
-      <w:proofErr w:type="gramStart"/>
       <w:r>
         <w:rPr>
           <w:rFonts w:ascii="Consolas" w:hAnsi="Consolas" w:cs="Consolas"/>
@@ -3131,7 +3117,6 @@
         <w:t>cadena.Substring</w:t>
       </w:r>
       <w:proofErr w:type="spellEnd"/>
-      <w:proofErr w:type="gramEnd"/>
       <w:r>
         <w:rPr>
           <w:rFonts w:ascii="Consolas" w:hAnsi="Consolas" w:cs="Consolas"/>
@@ -3205,7 +3190,6 @@
         <w:t xml:space="preserve"> = </w:t>
       </w:r>
       <w:proofErr w:type="spellStart"/>
-      <w:proofErr w:type="gramStart"/>
       <w:r>
         <w:rPr>
           <w:rFonts w:ascii="Consolas" w:hAnsi="Consolas" w:cs="Consolas"/>
@@ -3216,7 +3200,6 @@
         <w:t>cadena.Substring</w:t>
       </w:r>
       <w:proofErr w:type="spellEnd"/>
-      <w:proofErr w:type="gramEnd"/>
       <w:r>
         <w:rPr>
           <w:rFonts w:ascii="Consolas" w:hAnsi="Consolas" w:cs="Consolas"/>

</xml_diff>